<commit_message>
Project idea description updated
</commit_message>
<xml_diff>
--- a/Közösségi Segítségkérő Platform-leiras.docx
+++ b/Közösségi Segítségkérő Platform-leiras.docx
@@ -46,23 +46,7 @@
           <w:sz w:val="24"/>
           <w:szCs w:val="24"/>
         </w:rPr>
-        <w:t>a</w:t>
-      </w:r>
-      <w:r>
-        <w:rPr>
-          <w:rFonts w:ascii="Times New Roman" w:hAnsi="Times New Roman" w:cs="Times New Roman"/>
-          <w:sz w:val="24"/>
-          <w:szCs w:val="24"/>
-        </w:rPr>
-        <w:t>kár a</w:t>
-      </w:r>
-      <w:r>
-        <w:rPr>
-          <w:rFonts w:ascii="Times New Roman" w:hAnsi="Times New Roman" w:cs="Times New Roman"/>
-          <w:sz w:val="24"/>
-          <w:szCs w:val="24"/>
-        </w:rPr>
-        <w:t xml:space="preserve"> </w:t>
+        <w:t xml:space="preserve">akár a </w:t>
       </w:r>
       <w:r>
         <w:rPr>
@@ -112,47 +96,7 @@
           <w:sz w:val="24"/>
           <w:szCs w:val="24"/>
         </w:rPr>
-        <w:t>Elsősorban a közelben lakó embereket kötné össze a platform</w:t>
-      </w:r>
-      <w:r>
-        <w:rPr>
-          <w:rFonts w:ascii="Times New Roman" w:hAnsi="Times New Roman" w:cs="Times New Roman"/>
-          <w:sz w:val="24"/>
-          <w:szCs w:val="24"/>
-        </w:rPr>
-        <w:t xml:space="preserve"> a település alapján</w:t>
-      </w:r>
-      <w:r>
-        <w:rPr>
-          <w:rFonts w:ascii="Times New Roman" w:hAnsi="Times New Roman" w:cs="Times New Roman"/>
-          <w:sz w:val="24"/>
-          <w:szCs w:val="24"/>
-        </w:rPr>
-        <w:t>, így könnyen lehetővé válik a személyes segítség is</w:t>
-      </w:r>
-      <w:r>
-        <w:rPr>
-          <w:rFonts w:ascii="Times New Roman" w:hAnsi="Times New Roman" w:cs="Times New Roman"/>
-          <w:sz w:val="24"/>
-          <w:szCs w:val="24"/>
-        </w:rPr>
-        <w:t xml:space="preserve">, valamint bármilyen témájú és szaktudást igénylő feladatot </w:t>
-      </w:r>
-      <w:r>
-        <w:rPr>
-          <w:rFonts w:ascii="Times New Roman" w:hAnsi="Times New Roman" w:cs="Times New Roman"/>
-          <w:sz w:val="24"/>
-          <w:szCs w:val="24"/>
-        </w:rPr>
-        <w:t>közzé lehet tenni</w:t>
-      </w:r>
-      <w:r>
-        <w:rPr>
-          <w:rFonts w:ascii="Times New Roman" w:hAnsi="Times New Roman" w:cs="Times New Roman"/>
-          <w:sz w:val="24"/>
-          <w:szCs w:val="24"/>
-        </w:rPr>
-        <w:t xml:space="preserve">. </w:t>
+        <w:t xml:space="preserve">Elsősorban a közelben lakó embereket kötné össze a platform a település alapján, így könnyen lehetővé válik a személyes segítség is, valamint bármilyen témájú és szaktudást igénylő feladatot közzé lehet tenni. </w:t>
       </w:r>
       <w:r>
         <w:rPr>
@@ -216,15 +160,7 @@
           <w:sz w:val="24"/>
           <w:szCs w:val="24"/>
         </w:rPr>
-        <w:t xml:space="preserve"> és vállalhatnak feladatokat</w:t>
-      </w:r>
-      <w:r>
-        <w:rPr>
-          <w:rFonts w:ascii="Times New Roman" w:hAnsi="Times New Roman" w:cs="Times New Roman"/>
-          <w:sz w:val="24"/>
-          <w:szCs w:val="24"/>
-        </w:rPr>
-        <w:t>.</w:t>
+        <w:t xml:space="preserve"> és vállalhatnak feladatokat.</w:t>
       </w:r>
     </w:p>
     <w:p>
@@ -526,23 +462,7 @@
           <w:sz w:val="24"/>
           <w:szCs w:val="24"/>
         </w:rPr>
-        <w:t xml:space="preserve">Ez a lehetőség kifejezetten jól jöhet olyan embereknek, akiknek szükségük van jövedelem kiegészítésre, hiszen a platform segítségével </w:t>
-      </w:r>
-      <w:r>
-        <w:rPr>
-          <w:rFonts w:ascii="Times New Roman" w:hAnsi="Times New Roman" w:cs="Times New Roman"/>
-          <w:sz w:val="24"/>
-          <w:szCs w:val="24"/>
-        </w:rPr>
-        <w:t>könnyen tudnak számukra megfelelő feladatokat találni a közelben.</w:t>
-      </w:r>
-      <w:r>
-        <w:rPr>
-          <w:rFonts w:ascii="Times New Roman" w:hAnsi="Times New Roman" w:cs="Times New Roman"/>
-          <w:sz w:val="24"/>
-          <w:szCs w:val="24"/>
-        </w:rPr>
-        <w:t xml:space="preserve"> Ez lényegében hasonlít egy </w:t>
+        <w:t xml:space="preserve">Ez a lehetőség kifejezetten jól jöhet olyan embereknek, akiknek szükségük van jövedelem kiegészítésre, hiszen a platform segítségével könnyen tudnak számukra megfelelő feladatokat találni a közelben. Ez lényegében hasonlít egy </w:t>
       </w:r>
       <w:proofErr w:type="spellStart"/>
       <w:r>
@@ -677,31 +597,7 @@
           <w:sz w:val="24"/>
           <w:szCs w:val="24"/>
         </w:rPr>
-        <w:t xml:space="preserve">egy </w:t>
-      </w:r>
-      <w:r>
-        <w:rPr>
-          <w:rFonts w:ascii="Times New Roman" w:hAnsi="Times New Roman" w:cs="Times New Roman"/>
-          <w:sz w:val="24"/>
-          <w:szCs w:val="24"/>
-        </w:rPr>
-        <w:t>kép</w:t>
-      </w:r>
-      <w:r>
-        <w:rPr>
-          <w:rFonts w:ascii="Times New Roman" w:hAnsi="Times New Roman" w:cs="Times New Roman"/>
-          <w:sz w:val="24"/>
-          <w:szCs w:val="24"/>
-        </w:rPr>
-        <w:t xml:space="preserve"> </w:t>
-      </w:r>
-      <w:r>
-        <w:rPr>
-          <w:rFonts w:ascii="Times New Roman" w:hAnsi="Times New Roman" w:cs="Times New Roman"/>
-          <w:sz w:val="24"/>
-          <w:szCs w:val="24"/>
-        </w:rPr>
-        <w:t>felrakása a falra</w:t>
+        <w:t>egy kép felrakása a falra</w:t>
       </w:r>
       <w:r>
         <w:rPr>
@@ -856,6 +752,7 @@
     <w:p>
       <w:pPr>
         <w:spacing w:line="360" w:lineRule="auto"/>
+        <w:ind w:left="360"/>
         <w:rPr>
           <w:rFonts w:ascii="Times New Roman" w:hAnsi="Times New Roman" w:cs="Times New Roman"/>
           <w:sz w:val="24"/>
@@ -865,6 +762,42 @@
       <w:r>
         <w:rPr>
           <w:rFonts w:ascii="Times New Roman" w:hAnsi="Times New Roman" w:cs="Times New Roman"/>
+          <w:b/>
+          <w:bCs/>
+          <w:sz w:val="24"/>
+          <w:szCs w:val="24"/>
+        </w:rPr>
+        <w:t>Lehetőség a kisvállalkozások számára</w:t>
+      </w:r>
+      <w:r>
+        <w:rPr>
+          <w:rFonts w:ascii="Times New Roman" w:hAnsi="Times New Roman" w:cs="Times New Roman"/>
+          <w:sz w:val="24"/>
+          <w:szCs w:val="24"/>
+        </w:rPr>
+        <w:t>:</w:t>
+      </w:r>
+      <w:r>
+        <w:rPr>
+          <w:rFonts w:ascii="Times New Roman" w:hAnsi="Times New Roman" w:cs="Times New Roman"/>
+          <w:sz w:val="24"/>
+          <w:szCs w:val="24"/>
+        </w:rPr>
+        <w:t xml:space="preserve"> Mivel a kisvállalkozások nem olyan közismertek, ezért a platform lehetőséget ad számukra, hogy könnyebben szerezhessenek új ügyfeleket.</w:t>
+      </w:r>
+    </w:p>
+    <w:p>
+      <w:pPr>
+        <w:spacing w:line="360" w:lineRule="auto"/>
+        <w:rPr>
+          <w:rFonts w:ascii="Times New Roman" w:hAnsi="Times New Roman" w:cs="Times New Roman"/>
+          <w:sz w:val="24"/>
+          <w:szCs w:val="24"/>
+        </w:rPr>
+      </w:pPr>
+      <w:r>
+        <w:rPr>
+          <w:rFonts w:ascii="Times New Roman" w:hAnsi="Times New Roman" w:cs="Times New Roman"/>
           <w:sz w:val="24"/>
           <w:szCs w:val="24"/>
         </w:rPr>
@@ -985,6 +918,7 @@
         <w:t>, illetve egy alapvető szabályrendszer bevezetése.</w:t>
       </w:r>
     </w:p>
+    <w:p/>
     <w:p/>
     <w:sectPr>
       <w:pgSz w:w="11906" w:h="16838"/>
@@ -1553,6 +1487,7 @@
   <w:style w:type="paragraph" w:default="1" w:styleId="Norml">
     <w:name w:val="Normal"/>
     <w:qFormat/>
+    <w:rsid w:val="00647FC5"/>
   </w:style>
   <w:style w:type="paragraph" w:styleId="Cmsor1">
     <w:name w:val="heading 1"/>
@@ -1756,6 +1691,7 @@
   <w:style w:type="character" w:default="1" w:styleId="Bekezdsalapbettpusa">
     <w:name w:val="Default Paragraph Font"/>
     <w:uiPriority w:val="1"/>
+    <w:semiHidden/>
     <w:unhideWhenUsed/>
   </w:style>
   <w:style w:type="table" w:default="1" w:styleId="Normltblzat">

</xml_diff>